<commit_message>
Word handout: replace Takeaways with a Glossary, and use bullets for lists in the prose
Co-Authored-By: Claude Opus 5.5 <noreply@anthropic.com>
Claude-Session: https://claude.ai/code/session_011yPt7JPyNuRbB6DqwXJHtr
</commit_message>
<xml_diff>
--- a/Meal Squad Exercise.docx
+++ b/Meal Squad Exercise.docx
@@ -243,6 +243,7 @@
     <w:p>
       <w:pPr>
         <w:pStyle w:val="exercisebullet"/>
+        <w:spacing w:after="120"/>
       </w:pPr>
       <w:r>
         <w:rPr>
@@ -369,7 +370,87 @@
         <w:rPr>
           <w:i w:val="0"/>
         </w:rPr>
-        <w:t>The system has four agents and a coordinator. The first agent, the Recipe Scout, researches and proposes recipes. The second, the Recipe Pricer, calculates the cost of each recipe; it has already been built. The third, the Meal Planner, creates a five-day plan using the priced recipes. The fourth, the Shopper, chooses the class’s best plan and builds its Kroger cart; it has also been built already. Every group builds a Recipe Scout; groups that have time go on to build a Meal Planner.</w:t>
+        <w:t>The system has four agents and a coordinator that connects them:</w:t>
+      </w:r>
+    </w:p>
+    <w:p>
+      <w:pPr>
+        <w:pStyle w:val="exercisebullet"/>
+      </w:pPr>
+      <w:r>
+        <w:rPr>
+          <w:i/>
+        </w:rPr>
+        <w:t>Recipe Scout</w:t>
+      </w:r>
+      <w:r>
+        <w:rPr>
+          <w:i w:val="0"/>
+        </w:rPr>
+        <w:t xml:space="preserve"> (you build it): researches and proposes recipes.</w:t>
+      </w:r>
+    </w:p>
+    <w:p>
+      <w:pPr>
+        <w:pStyle w:val="exercisebullet"/>
+      </w:pPr>
+      <w:r>
+        <w:rPr>
+          <w:i/>
+        </w:rPr>
+        <w:t>Recipe Pricer</w:t>
+      </w:r>
+      <w:r>
+        <w:rPr>
+          <w:i w:val="0"/>
+        </w:rPr>
+        <w:t xml:space="preserve"> (already built): calculates the cost of each recipe.</w:t>
+      </w:r>
+    </w:p>
+    <w:p>
+      <w:pPr>
+        <w:pStyle w:val="exercisebullet"/>
+      </w:pPr>
+      <w:r>
+        <w:rPr>
+          <w:i/>
+        </w:rPr>
+        <w:t>Meal Planner</w:t>
+      </w:r>
+      <w:r>
+        <w:rPr>
+          <w:i w:val="0"/>
+        </w:rPr>
+        <w:t xml:space="preserve"> (you build it): creates a five-day plan using the priced recipes.</w:t>
+      </w:r>
+    </w:p>
+    <w:p>
+      <w:pPr>
+        <w:pStyle w:val="exercisebullet"/>
+        <w:spacing w:after="120"/>
+      </w:pPr>
+      <w:r>
+        <w:rPr>
+          <w:i/>
+        </w:rPr>
+        <w:t>Shopper</w:t>
+      </w:r>
+      <w:r>
+        <w:rPr>
+          <w:i w:val="0"/>
+        </w:rPr>
+        <w:t xml:space="preserve"> (already built): chooses the class’s best plan and builds its Kroger cart.</w:t>
+      </w:r>
+    </w:p>
+    <w:p>
+      <w:pPr>
+        <w:pStyle w:val="normaltext"/>
+      </w:pPr>
+      <w:r>
+        <w:rPr>
+          <w:i w:val="0"/>
+        </w:rPr>
+        <w:t>Every group builds a Recipe Scout; groups that have time go on to build a Meal Planner.</w:t>
       </w:r>
     </w:p>
     <w:p>
@@ -454,13 +535,37 @@
     </w:p>
     <w:p>
       <w:pPr>
-        <w:pStyle w:val="normaltext"/>
-      </w:pPr>
+        <w:pStyle w:val="exercisebullet"/>
+      </w:pPr>
+      <w:r>
+        <w:rPr>
+          <w:i/>
+        </w:rPr>
+        <w:t>An action</w:t>
+      </w:r>
       <w:r>
         <w:rPr>
           <w:i w:val="0"/>
         </w:rPr>
-        <w:t>An action (also called a tool) performs one specific task: search for a recipe, look up its ingredients, save it. It is ordinary code that always does the same thing. An agent is an AI model with a goal, a set of tools and a loop: it decides which actions to use and in what order, looks at each result, and decides what to do next until the job is done, or stops and explains why it can’t finish.</w:t>
+        <w:t xml:space="preserve"> (also called a tool) performs one specific task: search for a recipe, look up its ingredients, save it. It is ordinary code that always does the same thing.</w:t>
+      </w:r>
+    </w:p>
+    <w:p>
+      <w:pPr>
+        <w:pStyle w:val="exercisebullet"/>
+        <w:spacing w:after="120"/>
+      </w:pPr>
+      <w:r>
+        <w:rPr>
+          <w:i/>
+        </w:rPr>
+        <w:t>An agent</w:t>
+      </w:r>
+      <w:r>
+        <w:rPr>
+          <w:i w:val="0"/>
+        </w:rPr>
+        <w:t xml:space="preserve"> is an AI model with a goal, a set of tools and a loop: it decides which actions to use and in what order, looks at each result, and decides what to do next until the job is done, or stops and explains why it can’t finish.</w:t>
       </w:r>
     </w:p>
     <w:p>
@@ -551,7 +656,52 @@
         <w:rPr>
           <w:i w:val="0"/>
         </w:rPr>
-        <w:t>The coordinator is the shared hub of the system. The agents never talk to each other directly: each one connects to the coordinator using MCP, learns from it which tools it offers and how to use them, and saves its results there for the next agent. The coordinator checks everything it receives (the format, that recipes are real TheMealDB recipes, the limits and the class’s rules for a meal plan), works out the numbers itself so that no agent can make one up, and explains any rejection, so that an agent can fix its mistake and try again. Every request and answer appears, live, on the site’s Coordinator page.</w:t>
+        <w:t>The coordinator is the shared hub of the system. The agents never talk to each other directly: each one connects to the coordinator using MCP, learns from it which tools it offers and how to use them, and saves its results there for the next agent. The coordinator:</w:t>
+      </w:r>
+    </w:p>
+    <w:p>
+      <w:pPr>
+        <w:pStyle w:val="exercisebullet"/>
+      </w:pPr>
+      <w:r>
+        <w:rPr>
+          <w:i w:val="0"/>
+        </w:rPr>
+        <w:t>checks everything it receives: the format, that recipes are real TheMealDB recipes, the limits and the class’s rules for a meal plan;</w:t>
+      </w:r>
+    </w:p>
+    <w:p>
+      <w:pPr>
+        <w:pStyle w:val="exercisebullet"/>
+      </w:pPr>
+      <w:r>
+        <w:rPr>
+          <w:i w:val="0"/>
+        </w:rPr>
+        <w:t>works out the numbers itself, so that no agent can make one up;</w:t>
+      </w:r>
+    </w:p>
+    <w:p>
+      <w:pPr>
+        <w:pStyle w:val="exercisebullet"/>
+      </w:pPr>
+      <w:r>
+        <w:rPr>
+          <w:i w:val="0"/>
+        </w:rPr>
+        <w:t>explains any rejection, so that an agent can fix its mistake and try again;</w:t>
+      </w:r>
+    </w:p>
+    <w:p>
+      <w:pPr>
+        <w:pStyle w:val="exercisebullet"/>
+        <w:spacing w:after="120"/>
+      </w:pPr>
+      <w:r>
+        <w:rPr>
+          <w:i w:val="0"/>
+        </w:rPr>
+        <w:t>shows every request and answer, live, on the site’s Coordinator page.</w:t>
       </w:r>
     </w:p>
     <w:p>
@@ -647,13 +797,70 @@
     </w:p>
     <w:p>
       <w:pPr>
-        <w:pStyle w:val="normaltext"/>
-      </w:pPr>
+        <w:pStyle w:val="exercisebullet"/>
+      </w:pPr>
+      <w:r>
+        <w:rPr>
+          <w:i/>
+        </w:rPr>
+        <w:t>Recipes</w:t>
+      </w:r>
       <w:r>
         <w:rPr>
           <w:i w:val="0"/>
         </w:rPr>
-        <w:t>The recipes come from TheMealDB, a free, open database of real recipes with photos, ingredients and instructions; your Scout Agent calls it from your Lovable app’s backend with the free developer key “1”. The prices come from Kroger’s API, which needs credentials, so only the agents that run on the coordinator site use it. The Recipe Pricer prices every recipe per person: the cost of one serving when the recipe is cooked for many people. At the end, the Shopper Agent scales the chosen plan to the number of people shopping (50 by default) and turns it into one Kroger cart for the week. Prices are estimates when Kroger has no match, and they are labelled as such.</w:t>
+        <w:t xml:space="preserve"> come from TheMealDB, a free, open database of real recipes with photos, ingredients and instructions. Your Scout Agent calls it from your Lovable app’s backend with the free developer key “1”.</w:t>
+      </w:r>
+    </w:p>
+    <w:p>
+      <w:pPr>
+        <w:pStyle w:val="exercisebullet"/>
+      </w:pPr>
+      <w:r>
+        <w:rPr>
+          <w:i/>
+        </w:rPr>
+        <w:t>Prices</w:t>
+      </w:r>
+      <w:r>
+        <w:rPr>
+          <w:i w:val="0"/>
+        </w:rPr>
+        <w:t xml:space="preserve"> come from Kroger’s API, which needs credentials, so only the agents that run on the coordinator site use it.</w:t>
+      </w:r>
+    </w:p>
+    <w:p>
+      <w:pPr>
+        <w:pStyle w:val="exercisebullet"/>
+      </w:pPr>
+      <w:r>
+        <w:rPr>
+          <w:i w:val="0"/>
+        </w:rPr>
+        <w:t>The Recipe Pricer prices every recipe per person: the cost of one serving when the recipe is cooked for many people.</w:t>
+      </w:r>
+    </w:p>
+    <w:p>
+      <w:pPr>
+        <w:pStyle w:val="exercisebullet"/>
+      </w:pPr>
+      <w:r>
+        <w:rPr>
+          <w:i w:val="0"/>
+        </w:rPr>
+        <w:t>At the end, the Shopper Agent scales the chosen plan to the number of people shopping (50 by default) and turns it into one Kroger cart for the week.</w:t>
+      </w:r>
+    </w:p>
+    <w:p>
+      <w:pPr>
+        <w:pStyle w:val="exercisebullet"/>
+        <w:spacing w:after="120"/>
+      </w:pPr>
+      <w:r>
+        <w:rPr>
+          <w:i w:val="0"/>
+        </w:rPr>
+        <w:t>Prices are estimates when Kroger has no match, and they are labelled as such.</w:t>
       </w:r>
     </w:p>
     <w:p>
@@ -785,6 +992,7 @@
     <w:p>
       <w:pPr>
         <w:pStyle w:val="exercisebullet"/>
+        <w:spacing w:after="120"/>
       </w:pPr>
       <w:r>
         <w:rPr>
@@ -837,6 +1045,7 @@
     <w:p>
       <w:pPr>
         <w:pStyle w:val="exercisebullet"/>
+        <w:spacing w:after="120"/>
       </w:pPr>
       <w:r>
         <w:rPr>
@@ -933,27 +1142,141 @@
         <w:rPr>
           <w:i w:val="0"/>
         </w:rPr>
-        <w:t>Every step below has the same four parts: a goal (what the step adds, and why); a sample prompt to copy into Lovable, as it is or changed to make the app your own; what you should see (check it before moving on); and things you can try. The things you can try are where most of the learning happens: try to break your agent, and see whether it explains itself honestly.</w:t>
+        <w:t>Every step below has the same four parts:</w:t>
       </w:r>
     </w:p>
     <w:p>
       <w:pPr>
-        <w:pStyle w:val="h1"/>
-        <w:pageBreakBefore/>
-      </w:pPr>
-      <w:r>
-        <w:t>Part 1: The Recipe Scout (Agent 1)</w:t>
-      </w:r>
-    </w:p>
-    <w:p>
-      <w:pPr>
-        <w:pStyle w:val="normaltext"/>
-      </w:pPr>
+        <w:pStyle w:val="exercisebullet"/>
+      </w:pPr>
+      <w:r>
+        <w:rPr>
+          <w:i/>
+        </w:rPr>
+        <w:t>Goal:</w:t>
+      </w:r>
       <w:r>
         <w:rPr>
           <w:i w:val="0"/>
         </w:rPr>
-        <w:t>The Recipe Scout finds real recipes that fit a dinner theme and saves them to the coordinator. You build it in five stages: first a plain page, then ordinary actions that search TheMealDB, then the Scout Agent that decides how to use them, and finally the connection to the coordinator, so its recipes can be priced and used by the other agents.</w:t>
+        <w:t xml:space="preserve"> what the step adds, and why.</w:t>
+      </w:r>
+    </w:p>
+    <w:p>
+      <w:pPr>
+        <w:pStyle w:val="exercisebullet"/>
+      </w:pPr>
+      <w:r>
+        <w:rPr>
+          <w:i/>
+        </w:rPr>
+        <w:t>Sample prompt:</w:t>
+      </w:r>
+      <w:r>
+        <w:rPr>
+          <w:i w:val="0"/>
+        </w:rPr>
+        <w:t xml:space="preserve"> to copy into Lovable, as it is or changed to make the app your own.</w:t>
+      </w:r>
+    </w:p>
+    <w:p>
+      <w:pPr>
+        <w:pStyle w:val="exercisebullet"/>
+      </w:pPr>
+      <w:r>
+        <w:rPr>
+          <w:i/>
+        </w:rPr>
+        <w:t>What you should see:</w:t>
+      </w:r>
+      <w:r>
+        <w:rPr>
+          <w:i w:val="0"/>
+        </w:rPr>
+        <w:t xml:space="preserve"> check it before moving on.</w:t>
+      </w:r>
+    </w:p>
+    <w:p>
+      <w:pPr>
+        <w:pStyle w:val="exercisebullet"/>
+        <w:spacing w:after="120"/>
+      </w:pPr>
+      <w:r>
+        <w:rPr>
+          <w:i/>
+        </w:rPr>
+        <w:t>Things you can try:</w:t>
+      </w:r>
+      <w:r>
+        <w:rPr>
+          <w:i w:val="0"/>
+        </w:rPr>
+        <w:t xml:space="preserve"> where most of the learning happens. Try to break your agent, and see whether it explains itself honestly.</w:t>
+      </w:r>
+    </w:p>
+    <w:p>
+      <w:pPr>
+        <w:pStyle w:val="h1"/>
+        <w:pageBreakBefore/>
+      </w:pPr>
+      <w:r>
+        <w:t>Part 1: The Recipe Scout (Agent 1)</w:t>
+      </w:r>
+    </w:p>
+    <w:p>
+      <w:pPr>
+        <w:pStyle w:val="normaltext"/>
+      </w:pPr>
+      <w:r>
+        <w:rPr>
+          <w:i w:val="0"/>
+        </w:rPr>
+        <w:t>The Recipe Scout finds real recipes that fit a dinner theme and saves them to the coordinator. You build it in stages:</w:t>
+      </w:r>
+    </w:p>
+    <w:p>
+      <w:pPr>
+        <w:pStyle w:val="exercisebullet"/>
+      </w:pPr>
+      <w:r>
+        <w:rPr>
+          <w:i w:val="0"/>
+        </w:rPr>
+        <w:t>a plain page (step 0);</w:t>
+      </w:r>
+    </w:p>
+    <w:p>
+      <w:pPr>
+        <w:pStyle w:val="exercisebullet"/>
+      </w:pPr>
+      <w:r>
+        <w:rPr>
+          <w:i w:val="0"/>
+        </w:rPr>
+        <w:t>ordinary actions that search TheMealDB (step 1);</w:t>
+      </w:r>
+    </w:p>
+    <w:p>
+      <w:pPr>
+        <w:pStyle w:val="exercisebullet"/>
+      </w:pPr>
+      <w:r>
+        <w:rPr>
+          <w:i w:val="0"/>
+        </w:rPr>
+        <w:t>the Scout Agent that decides how to use them (step 2);</w:t>
+      </w:r>
+    </w:p>
+    <w:p>
+      <w:pPr>
+        <w:pStyle w:val="exercisebullet"/>
+        <w:spacing w:after="120"/>
+      </w:pPr>
+      <w:r>
+        <w:rPr>
+          <w:i w:val="0"/>
+        </w:rPr>
+        <w:t>the connection to the coordinator, so its recipes can be priced and used by the other agents (steps 3a and 3b).</w:t>
       </w:r>
     </w:p>
     <w:p>
@@ -1353,6 +1676,7 @@
     <w:p>
       <w:pPr>
         <w:pStyle w:val="exercisebullet"/>
+        <w:spacing w:after="120"/>
       </w:pPr>
       <w:r>
         <w:rPr>
@@ -1408,6 +1732,7 @@
     <w:p>
       <w:pPr>
         <w:pStyle w:val="exercisebullet"/>
+        <w:spacing w:after="120"/>
       </w:pPr>
       <w:r>
         <w:rPr>
@@ -1751,6 +2076,7 @@
     <w:p>
       <w:pPr>
         <w:pStyle w:val="exercisebullet"/>
+        <w:spacing w:after="120"/>
       </w:pPr>
       <w:r>
         <w:rPr>
@@ -1806,6 +2132,7 @@
     <w:p>
       <w:pPr>
         <w:pStyle w:val="exercisebullet"/>
+        <w:spacing w:after="120"/>
       </w:pPr>
       <w:r>
         <w:rPr>
@@ -2094,6 +2421,7 @@
     <w:p>
       <w:pPr>
         <w:pStyle w:val="exercisebullet"/>
+        <w:spacing w:after="120"/>
       </w:pPr>
       <w:r>
         <w:rPr>
@@ -2138,6 +2466,7 @@
     <w:p>
       <w:pPr>
         <w:pStyle w:val="exercisebullet"/>
+        <w:spacing w:after="120"/>
       </w:pPr>
       <w:r>
         <w:rPr>
@@ -2401,6 +2730,7 @@
     <w:p>
       <w:pPr>
         <w:pStyle w:val="exercisebullet"/>
+        <w:spacing w:after="120"/>
       </w:pPr>
       <w:r>
         <w:rPr>
@@ -2456,6 +2786,7 @@
     <w:p>
       <w:pPr>
         <w:pStyle w:val="exercisebullet"/>
+        <w:spacing w:after="120"/>
       </w:pPr>
       <w:r>
         <w:rPr>
@@ -2784,6 +3115,7 @@
     <w:p>
       <w:pPr>
         <w:pStyle w:val="exercisebullet"/>
+        <w:spacing w:after="120"/>
       </w:pPr>
       <w:r>
         <w:rPr>
@@ -2872,6 +3204,7 @@
     <w:p>
       <w:pPr>
         <w:pStyle w:val="exercisebullet"/>
+        <w:spacing w:after="120"/>
       </w:pPr>
       <w:r>
         <w:rPr>
@@ -2918,7 +3251,52 @@
         <w:rPr>
           <w:i w:val="0"/>
         </w:rPr>
-        <w:t>The Pricer Agent turns every recipe the Scout Agents save into a Kroger shopping cart with prices, so the Meal Planner Agents can compare recipes by cost. Nobody has to start it: it prices each new recipe by itself, as soon as a Scout Agent saves one, within a few minutes. It reads each recipe from the coordinator, searches Kroger for every ingredient, chooses a product or a close substitute (or estimates a price when Kroger has none), and saves the cart to the coordinator, which works out the cost of one serving.</w:t>
+        <w:t>The Pricer Agent turns every recipe the Scout Agents save into a Kroger shopping cart with prices, so the Meal Planner Agents can compare recipes by cost. Nobody has to start it: it prices each new recipe by itself, as soon as a Scout Agent saves one, within a few minutes. For each recipe it:</w:t>
+      </w:r>
+    </w:p>
+    <w:p>
+      <w:pPr>
+        <w:pStyle w:val="exercisebullet"/>
+      </w:pPr>
+      <w:r>
+        <w:rPr>
+          <w:i w:val="0"/>
+        </w:rPr>
+        <w:t>reads the recipe from the coordinator;</w:t>
+      </w:r>
+    </w:p>
+    <w:p>
+      <w:pPr>
+        <w:pStyle w:val="exercisebullet"/>
+      </w:pPr>
+      <w:r>
+        <w:rPr>
+          <w:i w:val="0"/>
+        </w:rPr>
+        <w:t>searches Kroger for every ingredient;</w:t>
+      </w:r>
+    </w:p>
+    <w:p>
+      <w:pPr>
+        <w:pStyle w:val="exercisebullet"/>
+      </w:pPr>
+      <w:r>
+        <w:rPr>
+          <w:i w:val="0"/>
+        </w:rPr>
+        <w:t>chooses a product or a close substitute, or estimates a price when Kroger has none;</w:t>
+      </w:r>
+    </w:p>
+    <w:p>
+      <w:pPr>
+        <w:pStyle w:val="exercisebullet"/>
+        <w:spacing w:after="120"/>
+      </w:pPr>
+      <w:r>
+        <w:rPr>
+          <w:i w:val="0"/>
+        </w:rPr>
+        <w:t>saves the cart to the coordinator, which works out the cost of one serving.</w:t>
       </w:r>
     </w:p>
     <w:p>
@@ -3021,7 +3399,52 @@
         <w:rPr>
           <w:i w:val="0"/>
         </w:rPr>
-        <w:t>If there’s time, build the Meal Planner in a new Lovable project. It reads the class’s priced recipes from the coordinator, drafts five dinners, asks the coordinator to check them against the budget and the class’s rules, fixes what fails, and saves the week for the Shopper Agent.</w:t>
+        <w:t>If there’s time, build the Meal Planner in a new Lovable project. Its agent:</w:t>
+      </w:r>
+    </w:p>
+    <w:p>
+      <w:pPr>
+        <w:pStyle w:val="exercisebullet"/>
+      </w:pPr>
+      <w:r>
+        <w:rPr>
+          <w:i w:val="0"/>
+        </w:rPr>
+        <w:t>reads the class’s priced recipes from the coordinator;</w:t>
+      </w:r>
+    </w:p>
+    <w:p>
+      <w:pPr>
+        <w:pStyle w:val="exercisebullet"/>
+      </w:pPr>
+      <w:r>
+        <w:rPr>
+          <w:i w:val="0"/>
+        </w:rPr>
+        <w:t>drafts five dinners;</w:t>
+      </w:r>
+    </w:p>
+    <w:p>
+      <w:pPr>
+        <w:pStyle w:val="exercisebullet"/>
+      </w:pPr>
+      <w:r>
+        <w:rPr>
+          <w:i w:val="0"/>
+        </w:rPr>
+        <w:t>asks the coordinator to check them against the budget and the class’s rules;</w:t>
+      </w:r>
+    </w:p>
+    <w:p>
+      <w:pPr>
+        <w:pStyle w:val="exercisebullet"/>
+        <w:spacing w:after="120"/>
+      </w:pPr>
+      <w:r>
+        <w:rPr>
+          <w:i w:val="0"/>
+        </w:rPr>
+        <w:t>fixes what fails, and saves the week for the Shopper Agent.</w:t>
       </w:r>
     </w:p>
     <w:p>
@@ -3416,6 +3839,7 @@
     <w:p>
       <w:pPr>
         <w:pStyle w:val="exercisebullet"/>
+        <w:spacing w:after="120"/>
       </w:pPr>
       <w:r>
         <w:rPr>
@@ -3438,6 +3862,7 @@
     <w:p>
       <w:pPr>
         <w:pStyle w:val="exercisebullet"/>
+        <w:spacing w:after="120"/>
       </w:pPr>
       <w:r>
         <w:rPr>
@@ -3749,6 +4174,7 @@
     <w:p>
       <w:pPr>
         <w:pStyle w:val="exercisebullet"/>
+        <w:spacing w:after="120"/>
       </w:pPr>
       <w:r>
         <w:rPr>
@@ -3793,6 +4219,7 @@
     <w:p>
       <w:pPr>
         <w:pStyle w:val="exercisebullet"/>
+        <w:spacing w:after="120"/>
       </w:pPr>
       <w:r>
         <w:rPr>
@@ -4186,6 +4613,7 @@
     <w:p>
       <w:pPr>
         <w:pStyle w:val="exercisebullet"/>
+        <w:spacing w:after="120"/>
       </w:pPr>
       <w:r>
         <w:rPr>
@@ -4285,6 +4713,7 @@
     <w:p>
       <w:pPr>
         <w:pStyle w:val="exercisebullet"/>
+        <w:spacing w:after="120"/>
       </w:pPr>
       <w:r>
         <w:rPr>
@@ -4331,7 +4760,52 @@
         <w:rPr>
           <w:i w:val="0"/>
         </w:rPr>
-        <w:t>The Shopper Agent compares the meal plans the Meal Planner Agents saved, chooses the one the class will cook, credits the group that made it, and does the class’s shopping: the week’s Kroger cart for it, for 50 people by default. It checks each product at Kroger that day, buys an ingredient that several dinners share only once, and replaces what the store no longer carries. It runs on the site: the instructor starts it, or it starts by itself once enough plans are saved. The class’s plan, the cart and why the Shopper Agent chose it appear on the site’s Shopper page.</w:t>
+        <w:t>The Shopper Agent does the class’s shopping. It:</w:t>
+      </w:r>
+    </w:p>
+    <w:p>
+      <w:pPr>
+        <w:pStyle w:val="exercisebullet"/>
+      </w:pPr>
+      <w:r>
+        <w:rPr>
+          <w:i w:val="0"/>
+        </w:rPr>
+        <w:t>compares the meal plans the Meal Planner Agents saved, chooses the one the class will cook, and credits the group that made it;</w:t>
+      </w:r>
+    </w:p>
+    <w:p>
+      <w:pPr>
+        <w:pStyle w:val="exercisebullet"/>
+      </w:pPr>
+      <w:r>
+        <w:rPr>
+          <w:i w:val="0"/>
+        </w:rPr>
+        <w:t>builds the week’s Kroger cart for it, for 50 people by default;</w:t>
+      </w:r>
+    </w:p>
+    <w:p>
+      <w:pPr>
+        <w:pStyle w:val="exercisebullet"/>
+        <w:spacing w:after="120"/>
+      </w:pPr>
+      <w:r>
+        <w:rPr>
+          <w:i w:val="0"/>
+        </w:rPr>
+        <w:t>checks each product at Kroger that day, buys an ingredient that several dinners share only once, and replaces what the store no longer carries.</w:t>
+      </w:r>
+    </w:p>
+    <w:p>
+      <w:pPr>
+        <w:pStyle w:val="normaltext"/>
+      </w:pPr>
+      <w:r>
+        <w:rPr>
+          <w:i w:val="0"/>
+        </w:rPr>
+        <w:t>It runs on the site: the instructor starts it, or it starts by itself once enough plans are saved. The class’s plan, the cart and why the Shopper Agent chose it appear on the site’s Shopper page.</w:t>
       </w:r>
     </w:p>
     <w:p>
@@ -4422,7 +4896,41 @@
         <w:rPr>
           <w:i w:val="0"/>
         </w:rPr>
-        <w:t>A step that fails is part of the exercise. Tell Lovable what you expected and what happened instead, and paste any error message you see. Look at what the agent did (its trace) before changing anything; if a change made things worse, ask Lovable to go back to the previous version. You don’t need to start over.</w:t>
+        <w:t>A step that fails is part of the exercise. You don’t need to start over:</w:t>
+      </w:r>
+    </w:p>
+    <w:p>
+      <w:pPr>
+        <w:pStyle w:val="exercisebullet"/>
+      </w:pPr>
+      <w:r>
+        <w:rPr>
+          <w:i w:val="0"/>
+        </w:rPr>
+        <w:t>Tell Lovable what you expected and what happened instead, and paste any error message you see.</w:t>
+      </w:r>
+    </w:p>
+    <w:p>
+      <w:pPr>
+        <w:pStyle w:val="exercisebullet"/>
+      </w:pPr>
+      <w:r>
+        <w:rPr>
+          <w:i w:val="0"/>
+        </w:rPr>
+        <w:t>Look at what the agent did (its trace) before changing anything.</w:t>
+      </w:r>
+    </w:p>
+    <w:p>
+      <w:pPr>
+        <w:pStyle w:val="exercisebullet"/>
+        <w:spacing w:after="120"/>
+      </w:pPr>
+      <w:r>
+        <w:rPr>
+          <w:i w:val="0"/>
+        </w:rPr>
+        <w:t>If a change made things worse, ask Lovable to go back to the previous version.</w:t>
       </w:r>
     </w:p>
     <w:tbl>
@@ -4693,177 +5201,829 @@
         <w:pStyle w:val="h1"/>
       </w:pPr>
       <w:r>
-        <w:t>Takeaways</w:t>
+        <w:t>Glossary</w:t>
       </w:r>
     </w:p>
+    <w:tbl>
+      <w:tblPr>
+        <w:tblLayout w:type="fixed"/>
+        <w:tblLook w:firstColumn="1" w:firstRow="1" w:lastColumn="0" w:lastRow="0" w:noHBand="0" w:noVBand="1" w:val="04A0"/>
+        <w:tblLayout w:type="fixed"/>
+        <w:tblW w:w="9000" w:type="dxa"/>
+        <w:tblBorders>
+          <w:top w:val="single" w:sz="4" w:space="0" w:color="BFBFBF"/>
+          <w:left w:val="single" w:sz="4" w:space="0" w:color="BFBFBF"/>
+          <w:bottom w:val="single" w:sz="4" w:space="0" w:color="BFBFBF"/>
+          <w:right w:val="single" w:sz="4" w:space="0" w:color="BFBFBF"/>
+          <w:insideH w:val="single" w:sz="4" w:space="0" w:color="BFBFBF"/>
+          <w:insideV w:val="single" w:sz="4" w:space="0" w:color="BFBFBF"/>
+        </w:tblBorders>
+        <w:tblCellMar>
+          <w:top w:w="60" w:type="dxa"/>
+          <w:left w:w="100" w:type="dxa"/>
+          <w:bottom w:w="60" w:type="dxa"/>
+          <w:right w:w="100" w:type="dxa"/>
+        </w:tblCellMar>
+      </w:tblPr>
+      <w:tblGrid>
+        <w:gridCol w:w="2400"/>
+        <w:gridCol w:w="6600"/>
+      </w:tblGrid>
+      <w:tr>
+        <w:trPr>
+          <w:cantSplit/>
+          <w:tblHeader/>
+        </w:trPr>
+        <w:tc>
+          <w:tcPr>
+            <w:tcW w:type="dxa" w:w="2400"/>
+            <w:shd w:val="clear" w:color="auto" w:fill="E6E9E4"/>
+          </w:tcPr>
+          <w:p>
+            <w:pPr>
+              <w:pStyle w:val="thfl"/>
+            </w:pPr>
+            <w:r>
+              <w:t>Term</w:t>
+            </w:r>
+          </w:p>
+        </w:tc>
+        <w:tc>
+          <w:tcPr>
+            <w:tcW w:type="dxa" w:w="6600"/>
+            <w:shd w:val="clear" w:color="auto" w:fill="E6E9E4"/>
+          </w:tcPr>
+          <w:p>
+            <w:pPr>
+              <w:pStyle w:val="thfl"/>
+            </w:pPr>
+            <w:r>
+              <w:t>Meaning</w:t>
+            </w:r>
+          </w:p>
+        </w:tc>
+      </w:tr>
+      <w:tr>
+        <w:trPr>
+          <w:cantSplit/>
+        </w:trPr>
+        <w:tc>
+          <w:tcPr>
+            <w:tcW w:type="dxa" w:w="2400"/>
+          </w:tcPr>
+          <w:p>
+            <w:pPr>
+              <w:pStyle w:val="tbfl"/>
+              <w:spacing w:line="240" w:lineRule="auto" w:after="0"/>
+            </w:pPr>
+            <w:r>
+              <w:rPr>
+                <w:b/>
+              </w:rPr>
+              <w:t>Action (tool)</w:t>
+            </w:r>
+          </w:p>
+        </w:tc>
+        <w:tc>
+          <w:tcPr>
+            <w:tcW w:type="dxa" w:w="6600"/>
+          </w:tcPr>
+          <w:p>
+            <w:pPr>
+              <w:pStyle w:val="tbfl"/>
+              <w:spacing w:line="240" w:lineRule="auto" w:after="0"/>
+            </w:pPr>
+            <w:r>
+              <w:t>Ordinary code that performs one specific task, such as searching for a recipe or saving it. It does the same thing every time. AI models call these “tools”.</w:t>
+            </w:r>
+          </w:p>
+        </w:tc>
+      </w:tr>
+      <w:tr>
+        <w:trPr>
+          <w:cantSplit/>
+        </w:trPr>
+        <w:tc>
+          <w:tcPr>
+            <w:tcW w:type="dxa" w:w="2400"/>
+          </w:tcPr>
+          <w:p>
+            <w:pPr>
+              <w:pStyle w:val="tbfl"/>
+              <w:spacing w:line="240" w:lineRule="auto" w:after="0"/>
+            </w:pPr>
+            <w:r>
+              <w:rPr>
+                <w:b/>
+              </w:rPr>
+              <w:t>Agent</w:t>
+            </w:r>
+          </w:p>
+        </w:tc>
+        <w:tc>
+          <w:tcPr>
+            <w:tcW w:type="dxa" w:w="6600"/>
+          </w:tcPr>
+          <w:p>
+            <w:pPr>
+              <w:pStyle w:val="tbfl"/>
+              <w:spacing w:line="240" w:lineRule="auto" w:after="0"/>
+            </w:pPr>
+            <w:r>
+              <w:t>An AI model with a goal, a set of tools and a loop: it decides which tools to use and in what order, looks at each result, and decides what to do next until the job is done or it stops and explains why.</w:t>
+            </w:r>
+          </w:p>
+        </w:tc>
+      </w:tr>
+      <w:tr>
+        <w:trPr>
+          <w:cantSplit/>
+        </w:trPr>
+        <w:tc>
+          <w:tcPr>
+            <w:tcW w:type="dxa" w:w="2400"/>
+          </w:tcPr>
+          <w:p>
+            <w:pPr>
+              <w:pStyle w:val="tbfl"/>
+              <w:spacing w:line="240" w:lineRule="auto" w:after="0"/>
+            </w:pPr>
+            <w:r>
+              <w:rPr>
+                <w:b/>
+              </w:rPr>
+              <w:t>Backend</w:t>
+            </w:r>
+          </w:p>
+        </w:tc>
+        <w:tc>
+          <w:tcPr>
+            <w:tcW w:type="dxa" w:w="6600"/>
+          </w:tcPr>
+          <w:p>
+            <w:pPr>
+              <w:pStyle w:val="tbfl"/>
+              <w:spacing w:line="240" w:lineRule="auto" w:after="0"/>
+            </w:pPr>
+            <w:r>
+              <w:t>The part of an app that runs on a server rather than in the browser. Secrets such as the class key, and every call to the coordinator, belong there.</w:t>
+            </w:r>
+          </w:p>
+        </w:tc>
+      </w:tr>
+      <w:tr>
+        <w:trPr>
+          <w:cantSplit/>
+        </w:trPr>
+        <w:tc>
+          <w:tcPr>
+            <w:tcW w:type="dxa" w:w="2400"/>
+          </w:tcPr>
+          <w:p>
+            <w:pPr>
+              <w:pStyle w:val="tbfl"/>
+              <w:spacing w:line="240" w:lineRule="auto" w:after="0"/>
+            </w:pPr>
+            <w:r>
+              <w:rPr>
+                <w:b/>
+              </w:rPr>
+              <w:t>Class key</w:t>
+            </w:r>
+          </w:p>
+        </w:tc>
+        <w:tc>
+          <w:tcPr>
+            <w:tcW w:type="dxa" w:w="6600"/>
+          </w:tcPr>
+          <w:p>
+            <w:pPr>
+              <w:pStyle w:val="tbfl"/>
+              <w:spacing w:line="240" w:lineRule="auto" w:after="0"/>
+            </w:pPr>
+            <w:r>
+              <w:t>The password your instructor gives you on the Welcome page. The coordinator only answers requests that carry it. Keep it in a Lovable secret, never in a prompt, page or chat.</w:t>
+            </w:r>
+          </w:p>
+        </w:tc>
+      </w:tr>
+      <w:tr>
+        <w:trPr>
+          <w:cantSplit/>
+        </w:trPr>
+        <w:tc>
+          <w:tcPr>
+            <w:tcW w:type="dxa" w:w="2400"/>
+          </w:tcPr>
+          <w:p>
+            <w:pPr>
+              <w:pStyle w:val="tbfl"/>
+              <w:spacing w:line="240" w:lineRule="auto" w:after="0"/>
+            </w:pPr>
+            <w:r>
+              <w:rPr>
+                <w:b/>
+              </w:rPr>
+              <w:t>Contract</w:t>
+            </w:r>
+          </w:p>
+        </w:tc>
+        <w:tc>
+          <w:tcPr>
+            <w:tcW w:type="dxa" w:w="6600"/>
+          </w:tcPr>
+          <w:p>
+            <w:pPr>
+              <w:pStyle w:val="tbfl"/>
+              <w:spacing w:line="240" w:lineRule="auto" w:after="0"/>
+            </w:pPr>
+            <w:r>
+              <w:t>What the coordinator tells each agent through its get_contract tool: the formats it accepts, the rules it checks and the limits that apply.</w:t>
+            </w:r>
+          </w:p>
+        </w:tc>
+      </w:tr>
+      <w:tr>
+        <w:trPr>
+          <w:cantSplit/>
+        </w:trPr>
+        <w:tc>
+          <w:tcPr>
+            <w:tcW w:type="dxa" w:w="2400"/>
+          </w:tcPr>
+          <w:p>
+            <w:pPr>
+              <w:pStyle w:val="tbfl"/>
+              <w:spacing w:line="240" w:lineRule="auto" w:after="0"/>
+            </w:pPr>
+            <w:r>
+              <w:rPr>
+                <w:b/>
+              </w:rPr>
+              <w:t>Coordinator</w:t>
+            </w:r>
+          </w:p>
+        </w:tc>
+        <w:tc>
+          <w:tcPr>
+            <w:tcW w:type="dxa" w:w="6600"/>
+          </w:tcPr>
+          <w:p>
+            <w:pPr>
+              <w:pStyle w:val="tbfl"/>
+              <w:spacing w:line="240" w:lineRule="auto" w:after="0"/>
+            </w:pPr>
+            <w:r>
+              <w:t>The shared hub of the system. Ordinary code, with no AI, that checks every request, saves the results and hands them to the next agent. The agents never talk to each other directly.</w:t>
+            </w:r>
+          </w:p>
+        </w:tc>
+      </w:tr>
+      <w:tr>
+        <w:trPr>
+          <w:cantSplit/>
+        </w:trPr>
+        <w:tc>
+          <w:tcPr>
+            <w:tcW w:type="dxa" w:w="2400"/>
+          </w:tcPr>
+          <w:p>
+            <w:pPr>
+              <w:pStyle w:val="tbfl"/>
+              <w:spacing w:line="240" w:lineRule="auto" w:after="0"/>
+            </w:pPr>
+            <w:r>
+              <w:rPr>
+                <w:b/>
+              </w:rPr>
+              <w:t>CORS error</w:t>
+            </w:r>
+          </w:p>
+        </w:tc>
+        <w:tc>
+          <w:tcPr>
+            <w:tcW w:type="dxa" w:w="6600"/>
+          </w:tcPr>
+          <w:p>
+            <w:pPr>
+              <w:pStyle w:val="tbfl"/>
+              <w:spacing w:line="240" w:lineRule="auto" w:after="0"/>
+            </w:pPr>
+            <w:r>
+              <w:t>A browser error that appears when a page calls another site directly. Moving the call into a backend function fixes it.</w:t>
+            </w:r>
+          </w:p>
+        </w:tc>
+      </w:tr>
+      <w:tr>
+        <w:trPr>
+          <w:cantSplit/>
+        </w:trPr>
+        <w:tc>
+          <w:tcPr>
+            <w:tcW w:type="dxa" w:w="2400"/>
+          </w:tcPr>
+          <w:p>
+            <w:pPr>
+              <w:pStyle w:val="tbfl"/>
+              <w:spacing w:line="240" w:lineRule="auto" w:after="0"/>
+            </w:pPr>
+            <w:r>
+              <w:rPr>
+                <w:b/>
+              </w:rPr>
+              <w:t>Group name</w:t>
+            </w:r>
+          </w:p>
+        </w:tc>
+        <w:tc>
+          <w:tcPr>
+            <w:tcW w:type="dxa" w:w="6600"/>
+          </w:tcPr>
+          <w:p>
+            <w:pPr>
+              <w:pStyle w:val="tbfl"/>
+              <w:spacing w:line="240" w:lineRule="auto" w:after="0"/>
+            </w:pPr>
+            <w:r>
+              <w:t>Your group’s unique name (for example team-3). It is sent with every request so the coordinator knows whose work it is.</w:t>
+            </w:r>
+          </w:p>
+        </w:tc>
+      </w:tr>
+      <w:tr>
+        <w:trPr>
+          <w:cantSplit/>
+        </w:trPr>
+        <w:tc>
+          <w:tcPr>
+            <w:tcW w:type="dxa" w:w="2400"/>
+          </w:tcPr>
+          <w:p>
+            <w:pPr>
+              <w:pStyle w:val="tbfl"/>
+              <w:spacing w:line="240" w:lineRule="auto" w:after="0"/>
+            </w:pPr>
+            <w:r>
+              <w:rPr>
+                <w:b/>
+              </w:rPr>
+              <w:t>Handoff</w:t>
+            </w:r>
+          </w:p>
+        </w:tc>
+        <w:tc>
+          <w:tcPr>
+            <w:tcW w:type="dxa" w:w="6600"/>
+          </w:tcPr>
+          <w:p>
+            <w:pPr>
+              <w:pStyle w:val="tbfl"/>
+              <w:spacing w:line="240" w:lineRule="auto" w:after="0"/>
+            </w:pPr>
+            <w:r>
+              <w:t>The moment one agent’s saved work becomes the next agent’s input, through the coordinator.</w:t>
+            </w:r>
+          </w:p>
+        </w:tc>
+      </w:tr>
+      <w:tr>
+        <w:trPr>
+          <w:cantSplit/>
+        </w:trPr>
+        <w:tc>
+          <w:tcPr>
+            <w:tcW w:type="dxa" w:w="2400"/>
+          </w:tcPr>
+          <w:p>
+            <w:pPr>
+              <w:pStyle w:val="tbfl"/>
+              <w:spacing w:line="240" w:lineRule="auto" w:after="0"/>
+            </w:pPr>
+            <w:r>
+              <w:rPr>
+                <w:b/>
+              </w:rPr>
+              <w:t>Kroger</w:t>
+            </w:r>
+          </w:p>
+        </w:tc>
+        <w:tc>
+          <w:tcPr>
+            <w:tcW w:type="dxa" w:w="6600"/>
+          </w:tcPr>
+          <w:p>
+            <w:pPr>
+              <w:pStyle w:val="tbfl"/>
+              <w:spacing w:line="240" w:lineRule="auto" w:after="0"/>
+            </w:pPr>
+            <w:r>
+              <w:t>A US grocery chain whose API lists the products in a store, with today’s prices and sizes. The Pricer and Shopper Agents use it.</w:t>
+            </w:r>
+          </w:p>
+        </w:tc>
+      </w:tr>
+      <w:tr>
+        <w:trPr>
+          <w:cantSplit/>
+        </w:trPr>
+        <w:tc>
+          <w:tcPr>
+            <w:tcW w:type="dxa" w:w="2400"/>
+          </w:tcPr>
+          <w:p>
+            <w:pPr>
+              <w:pStyle w:val="tbfl"/>
+              <w:spacing w:line="240" w:lineRule="auto" w:after="0"/>
+            </w:pPr>
+            <w:r>
+              <w:rPr>
+                <w:b/>
+              </w:rPr>
+              <w:t>Lovable</w:t>
+            </w:r>
+          </w:p>
+        </w:tc>
+        <w:tc>
+          <w:tcPr>
+            <w:tcW w:type="dxa" w:w="6600"/>
+          </w:tcPr>
+          <w:p>
+            <w:pPr>
+              <w:pStyle w:val="tbfl"/>
+              <w:spacing w:line="240" w:lineRule="auto" w:after="0"/>
+            </w:pPr>
+            <w:r>
+              <w:t>The tool you use to build your apps by describing them in plain language. Build mode writes the code; Plan mode only talks the change through.</w:t>
+            </w:r>
+          </w:p>
+        </w:tc>
+      </w:tr>
+      <w:tr>
+        <w:trPr>
+          <w:cantSplit/>
+        </w:trPr>
+        <w:tc>
+          <w:tcPr>
+            <w:tcW w:type="dxa" w:w="2400"/>
+          </w:tcPr>
+          <w:p>
+            <w:pPr>
+              <w:pStyle w:val="tbfl"/>
+              <w:spacing w:line="240" w:lineRule="auto" w:after="0"/>
+            </w:pPr>
+            <w:r>
+              <w:rPr>
+                <w:b/>
+              </w:rPr>
+              <w:t>Lovable Cloud</w:t>
+            </w:r>
+          </w:p>
+        </w:tc>
+        <w:tc>
+          <w:tcPr>
+            <w:tcW w:type="dxa" w:w="6600"/>
+          </w:tcPr>
+          <w:p>
+            <w:pPr>
+              <w:pStyle w:val="tbfl"/>
+              <w:spacing w:line="240" w:lineRule="auto" w:after="0"/>
+            </w:pPr>
+            <w:r>
+              <w:t>The backend Lovable adds to your app when you approve it, so the app can call TheMealDB and the coordinator from a server.</w:t>
+            </w:r>
+          </w:p>
+        </w:tc>
+      </w:tr>
+      <w:tr>
+        <w:trPr>
+          <w:cantSplit/>
+        </w:trPr>
+        <w:tc>
+          <w:tcPr>
+            <w:tcW w:type="dxa" w:w="2400"/>
+          </w:tcPr>
+          <w:p>
+            <w:pPr>
+              <w:pStyle w:val="tbfl"/>
+              <w:spacing w:line="240" w:lineRule="auto" w:after="0"/>
+            </w:pPr>
+            <w:r>
+              <w:rPr>
+                <w:b/>
+              </w:rPr>
+              <w:t>Lovable secret</w:t>
+            </w:r>
+          </w:p>
+        </w:tc>
+        <w:tc>
+          <w:tcPr>
+            <w:tcW w:type="dxa" w:w="6600"/>
+          </w:tcPr>
+          <w:p>
+            <w:pPr>
+              <w:pStyle w:val="tbfl"/>
+              <w:spacing w:line="240" w:lineRule="auto" w:after="0"/>
+            </w:pPr>
+            <w:r>
+              <w:t>A protected value stored in your Lovable project, such as the class key. The app can use it, but it never appears in your code or page.</w:t>
+            </w:r>
+          </w:p>
+        </w:tc>
+      </w:tr>
+      <w:tr>
+        <w:trPr>
+          <w:cantSplit/>
+        </w:trPr>
+        <w:tc>
+          <w:tcPr>
+            <w:tcW w:type="dxa" w:w="2400"/>
+          </w:tcPr>
+          <w:p>
+            <w:pPr>
+              <w:pStyle w:val="tbfl"/>
+              <w:spacing w:line="240" w:lineRule="auto" w:after="0"/>
+            </w:pPr>
+            <w:r>
+              <w:rPr>
+                <w:b/>
+              </w:rPr>
+              <w:t>MCP (Model Context Protocol)</w:t>
+            </w:r>
+          </w:p>
+        </w:tc>
+        <w:tc>
+          <w:tcPr>
+            <w:tcW w:type="dxa" w:w="6600"/>
+          </w:tcPr>
+          <w:p>
+            <w:pPr>
+              <w:pStyle w:val="tbfl"/>
+              <w:spacing w:line="240" w:lineRule="auto" w:after="0"/>
+            </w:pPr>
+            <w:r>
+              <w:t>A standard way for an app to discover what another system can do. Your app asks the coordinator which tools it offers and gets each tool’s name, description and inputs.</w:t>
+            </w:r>
+          </w:p>
+        </w:tc>
+      </w:tr>
+      <w:tr>
+        <w:trPr>
+          <w:cantSplit/>
+        </w:trPr>
+        <w:tc>
+          <w:tcPr>
+            <w:tcW w:type="dxa" w:w="2400"/>
+          </w:tcPr>
+          <w:p>
+            <w:pPr>
+              <w:pStyle w:val="tbfl"/>
+              <w:spacing w:line="240" w:lineRule="auto" w:after="0"/>
+            </w:pPr>
+            <w:r>
+              <w:rPr>
+                <w:b/>
+              </w:rPr>
+              <w:t>Meal plan</w:t>
+            </w:r>
+          </w:p>
+        </w:tc>
+        <w:tc>
+          <w:tcPr>
+            <w:tcW w:type="dxa" w:w="6600"/>
+          </w:tcPr>
+          <w:p>
+            <w:pPr>
+              <w:pStyle w:val="tbfl"/>
+              <w:spacing w:line="240" w:lineRule="auto" w:after="0"/>
+            </w:pPr>
+            <w:r>
+              <w:t>Five dinners, Monday to Friday, saved by a Meal Planner Agent with a budget and a reason for each choice.</w:t>
+            </w:r>
+          </w:p>
+        </w:tc>
+      </w:tr>
+      <w:tr>
+        <w:trPr>
+          <w:cantSplit/>
+        </w:trPr>
+        <w:tc>
+          <w:tcPr>
+            <w:tcW w:type="dxa" w:w="2400"/>
+          </w:tcPr>
+          <w:p>
+            <w:pPr>
+              <w:pStyle w:val="tbfl"/>
+              <w:spacing w:line="240" w:lineRule="auto" w:after="0"/>
+            </w:pPr>
+            <w:r>
+              <w:rPr>
+                <w:b/>
+              </w:rPr>
+              <w:t>Popularity</w:t>
+            </w:r>
+          </w:p>
+        </w:tc>
+        <w:tc>
+          <w:tcPr>
+            <w:tcW w:type="dxa" w:w="6600"/>
+          </w:tcPr>
+          <w:p>
+            <w:pPr>
+              <w:pStyle w:val="tbfl"/>
+              <w:spacing w:line="240" w:lineRule="auto" w:after="0"/>
+            </w:pPr>
+            <w:r>
+              <w:t>How many groups scouted the same recipe. The Meal Planner uses it to break ties.</w:t>
+            </w:r>
+          </w:p>
+        </w:tc>
+      </w:tr>
+      <w:tr>
+        <w:trPr>
+          <w:cantSplit/>
+        </w:trPr>
+        <w:tc>
+          <w:tcPr>
+            <w:tcW w:type="dxa" w:w="2400"/>
+          </w:tcPr>
+          <w:p>
+            <w:pPr>
+              <w:pStyle w:val="tbfl"/>
+              <w:spacing w:line="240" w:lineRule="auto" w:after="0"/>
+            </w:pPr>
+            <w:r>
+              <w:rPr>
+                <w:b/>
+              </w:rPr>
+              <w:t>Prompt</w:t>
+            </w:r>
+          </w:p>
+        </w:tc>
+        <w:tc>
+          <w:tcPr>
+            <w:tcW w:type="dxa" w:w="6600"/>
+          </w:tcPr>
+          <w:p>
+            <w:pPr>
+              <w:pStyle w:val="tbfl"/>
+              <w:spacing w:line="240" w:lineRule="auto" w:after="0"/>
+            </w:pPr>
+            <w:r>
+              <w:t>The instructions you type into Lovable. The sample prompts in this document can be pasted as they are or changed.</w:t>
+            </w:r>
+          </w:p>
+        </w:tc>
+      </w:tr>
+      <w:tr>
+        <w:trPr>
+          <w:cantSplit/>
+        </w:trPr>
+        <w:tc>
+          <w:tcPr>
+            <w:tcW w:type="dxa" w:w="2400"/>
+          </w:tcPr>
+          <w:p>
+            <w:pPr>
+              <w:pStyle w:val="tbfl"/>
+              <w:spacing w:line="240" w:lineRule="auto" w:after="0"/>
+            </w:pPr>
+            <w:r>
+              <w:rPr>
+                <w:b/>
+              </w:rPr>
+              <w:t>Rejection</w:t>
+            </w:r>
+          </w:p>
+        </w:tc>
+        <w:tc>
+          <w:tcPr>
+            <w:tcW w:type="dxa" w:w="6600"/>
+          </w:tcPr>
+          <w:p>
+            <w:pPr>
+              <w:pStyle w:val="tbfl"/>
+              <w:spacing w:line="240" w:lineRule="auto" w:after="0"/>
+            </w:pPr>
+            <w:r>
+              <w:t>The coordinator’s answer when a save breaks a rule. It lists every problem, so a good agent reads it, fixes the mistake and tries again.</w:t>
+            </w:r>
+          </w:p>
+        </w:tc>
+      </w:tr>
+      <w:tr>
+        <w:trPr>
+          <w:cantSplit/>
+        </w:trPr>
+        <w:tc>
+          <w:tcPr>
+            <w:tcW w:type="dxa" w:w="2400"/>
+          </w:tcPr>
+          <w:p>
+            <w:pPr>
+              <w:pStyle w:val="tbfl"/>
+              <w:spacing w:line="240" w:lineRule="auto" w:after="0"/>
+            </w:pPr>
+            <w:r>
+              <w:rPr>
+                <w:b/>
+              </w:rPr>
+              <w:t>Rules (checks)</w:t>
+            </w:r>
+          </w:p>
+        </w:tc>
+        <w:tc>
+          <w:tcPr>
+            <w:tcW w:type="dxa" w:w="6600"/>
+          </w:tcPr>
+          <w:p>
+            <w:pPr>
+              <w:pStyle w:val="tbfl"/>
+              <w:spacing w:line="240" w:lineRule="auto" w:after="0"/>
+            </w:pPr>
+            <w:r>
+              <w:t>The conditions the coordinator checks for every meal plan, such as the budget or the number of different cuisines. Your instructor chooses them.</w:t>
+            </w:r>
+          </w:p>
+        </w:tc>
+      </w:tr>
+      <w:tr>
+        <w:trPr>
+          <w:cantSplit/>
+        </w:trPr>
+        <w:tc>
+          <w:tcPr>
+            <w:tcW w:type="dxa" w:w="2400"/>
+          </w:tcPr>
+          <w:p>
+            <w:pPr>
+              <w:pStyle w:val="tbfl"/>
+              <w:spacing w:line="240" w:lineRule="auto" w:after="0"/>
+            </w:pPr>
+            <w:r>
+              <w:rPr>
+                <w:b/>
+              </w:rPr>
+              <w:t>TheMealDB</w:t>
+            </w:r>
+          </w:p>
+        </w:tc>
+        <w:tc>
+          <w:tcPr>
+            <w:tcW w:type="dxa" w:w="6600"/>
+          </w:tcPr>
+          <w:p>
+            <w:pPr>
+              <w:pStyle w:val="tbfl"/>
+              <w:spacing w:line="240" w:lineRule="auto" w:after="0"/>
+            </w:pPr>
+            <w:r>
+              <w:t>A free, open database of real recipes with photos, ingredients and instructions, used by the Scout Agents.</w:t>
+            </w:r>
+          </w:p>
+        </w:tc>
+      </w:tr>
+      <w:tr>
+        <w:trPr>
+          <w:cantSplit/>
+        </w:trPr>
+        <w:tc>
+          <w:tcPr>
+            <w:tcW w:type="dxa" w:w="2400"/>
+          </w:tcPr>
+          <w:p>
+            <w:pPr>
+              <w:pStyle w:val="tbfl"/>
+              <w:spacing w:line="240" w:lineRule="auto" w:after="0"/>
+            </w:pPr>
+            <w:r>
+              <w:rPr>
+                <w:b/>
+              </w:rPr>
+              <w:t>Trace</w:t>
+            </w:r>
+          </w:p>
+        </w:tc>
+        <w:tc>
+          <w:tcPr>
+            <w:tcW w:type="dxa" w:w="6600"/>
+          </w:tcPr>
+          <w:p>
+            <w:pPr>
+              <w:pStyle w:val="tbfl"/>
+              <w:spacing w:line="240" w:lineRule="auto" w:after="0"/>
+            </w:pPr>
+            <w:r>
+              <w:t>The step-by-step record of what an agent did: each tool it called and the answer it got. Shown in each app’s “What the agent is doing” panel and on the site’s Coordinator page.</w:t>
+            </w:r>
+          </w:p>
+        </w:tc>
+      </w:tr>
+    </w:tbl>
     <w:p>
       <w:pPr>
-        <w:pStyle w:val="normaltext"/>
-      </w:pPr>
-      <w:r>
-        <w:rPr>
-          <w:i w:val="0"/>
-        </w:rPr>
-        <w:t>Look back at the system the class built.</w:t>
-      </w:r>
-    </w:p>
-    <w:p>
-      <w:pPr>
-        <w:pStyle w:val="exerciselabel"/>
-      </w:pPr>
-      <w:r>
-        <w:rPr>
-          <w:b/>
-        </w:rPr>
-        <w:t>How agents work together</w:t>
-      </w:r>
-    </w:p>
-    <w:p>
-      <w:pPr>
-        <w:pStyle w:val="exercisebullet"/>
-      </w:pPr>
-      <w:r>
-        <w:rPr>
-          <w:i/>
-        </w:rPr>
-        <w:t>One agent, one job.</w:t>
-      </w:r>
-      <w:r>
-        <w:rPr>
-          <w:i w:val="0"/>
-        </w:rPr>
-        <w:t xml:space="preserve"> The Scout, Pricer, Meal Planner and Shopper Agents each do one thing well, and are easier to build, test and fix.</w:t>
-      </w:r>
-    </w:p>
-    <w:p>
-      <w:pPr>
-        <w:pStyle w:val="exercisebullet"/>
-      </w:pPr>
-      <w:r>
-        <w:rPr>
-          <w:i/>
-        </w:rPr>
-        <w:t>The handoff is the design.</w:t>
-      </w:r>
-      <w:r>
-        <w:rPr>
-          <w:i w:val="0"/>
-        </w:rPr>
-        <w:t xml:space="preserve"> A coordinator with a clear contract lets agents work together without ever talking to each other.</w:t>
-      </w:r>
-    </w:p>
-    <w:p>
-      <w:pPr>
-        <w:pStyle w:val="exercisebullet"/>
-      </w:pPr>
-      <w:r>
-        <w:rPr>
-          <w:i/>
-        </w:rPr>
-        <w:t>Check, don’t trust.</w:t>
-      </w:r>
-      <w:r>
-        <w:rPr>
-          <w:i w:val="0"/>
-        </w:rPr>
-        <w:t xml:space="preserve"> The coordinator checks every save and code does the arithmetic. The agent decides; the system verifies.</w:t>
-      </w:r>
-    </w:p>
-    <w:p>
-      <w:pPr>
-        <w:pStyle w:val="exercisebullet"/>
-      </w:pPr>
-      <w:r>
-        <w:rPr>
-          <w:i/>
-        </w:rPr>
-        <w:t>Real data is messy.</w:t>
-      </w:r>
-      <w:r>
-        <w:rPr>
-          <w:i w:val="0"/>
-        </w:rPr>
-        <w:t xml:space="preserve"> Missing products, substitutes, estimates, changing prices. Good agents label what they’re unsure of.</w:t>
-      </w:r>
-    </w:p>
-    <w:p>
-      <w:pPr>
-        <w:pStyle w:val="exerciselabel"/>
-      </w:pPr>
-      <w:r>
-        <w:rPr>
-          <w:b/>
-        </w:rPr>
-        <w:t>What to take into your own work</w:t>
-      </w:r>
-    </w:p>
-    <w:p>
-      <w:pPr>
-        <w:pStyle w:val="exercisebullet"/>
-      </w:pPr>
-      <w:r>
-        <w:rPr>
-          <w:i/>
-        </w:rPr>
-        <w:t>Evaluate, don’t eyeball.</w:t>
-      </w:r>
-      <w:r>
-        <w:rPr>
-          <w:i w:val="0"/>
-        </w:rPr>
-        <w:t xml:space="preserve"> Agents vary from run to run, and a small prompt change can shift what they do. Decide what good looks like, test on a fixed set of cases, and re-run them after every change.</w:t>
-      </w:r>
-    </w:p>
-    <w:p>
-      <w:pPr>
-        <w:pStyle w:val="exercisebullet"/>
-      </w:pPr>
-      <w:r>
-        <w:rPr>
-          <w:i/>
-        </w:rPr>
-        <w:t>Read the traces.</w:t>
-      </w:r>
-      <w:r>
-        <w:rPr>
-          <w:i w:val="0"/>
-        </w:rPr>
-        <w:t xml:space="preserve"> What an agent did, step by step, tells you more than what it says it did.</w:t>
-      </w:r>
-    </w:p>
-    <w:p>
-      <w:pPr>
-        <w:pStyle w:val="exercisebullet"/>
-      </w:pPr>
-      <w:r>
-        <w:rPr>
-          <w:i/>
-        </w:rPr>
-        <w:t>Keep people in the loop.</w:t>
-      </w:r>
-      <w:r>
-        <w:rPr>
-          <w:i w:val="0"/>
-        </w:rPr>
-        <w:t xml:space="preserve"> People decide when agents run, review their choices, and double-check before money is spent.</w:t>
-      </w:r>
-    </w:p>
-    <w:p>
-      <w:pPr>
-        <w:pStyle w:val="exercisebullet"/>
-      </w:pPr>
-      <w:r>
-        <w:rPr>
-          <w:i/>
-        </w:rPr>
-        <w:t>Start small, then connect.</w:t>
-      </w:r>
-      <w:r>
-        <w:rPr>
-          <w:i w:val="0"/>
-        </w:rPr>
-        <w:t xml:space="preserve"> One agent working end to end beats five half-built. Add the next when the handoff works.</w:t>
-      </w:r>
+        <w:pStyle w:val="normaltextnoindent"/>
+      </w:pPr>
     </w:p>
     <w:sectPr>
       <w:headerReference w:type="even" r:id="rId14"/>

</xml_diff>